<commit_message>
Refresh representative resume and portfolio documentation
</commit_message>
<xml_diff>
--- a/resume/Sung_Jung_Resume.docx
+++ b/resume/Sung_Jung_Resume.docx
@@ -4,14 +4,13 @@
   <w:body>
     <w:p>
       <w:pPr>
-        <w:spacing w:after="20"/>
+        <w:spacing w:after="0"/>
         <w:jc w:val="center"/>
       </w:pPr>
       <w:r>
         <w:rPr>
-          <w:rFonts w:ascii="Arial" w:hAnsi="Arial"/>
           <w:b/>
-          <w:color w:val="12263A"/>
+          <w:color w:val="162A3B"/>
           <w:sz w:val="48"/>
         </w:rPr>
         <w:t>SUNG JUNG</w:t>
@@ -19,78 +18,58 @@
     </w:p>
     <w:p>
       <w:pPr>
-        <w:spacing w:after="60"/>
+        <w:spacing w:after="40"/>
         <w:jc w:val="center"/>
       </w:pPr>
       <w:r>
         <w:rPr>
           <w:b/>
-          <w:color w:val="1F7A46"/>
-          <w:sz w:val="20"/>
+          <w:color w:val="197E4C"/>
+          <w:sz w:val="22"/>
         </w:rPr>
-        <w:t>QA ENGINEER  |  TEST AUTOMATION  |  OPERATIONS SYSTEMS</w:t>
+        <w:t>OPERATIONS SYSTEMS | QUALITY ENGINEERING | WORKFLOW AUTOMATION</w:t>
       </w:r>
     </w:p>
     <w:p>
       <w:pPr>
-        <w:spacing w:after="100"/>
+        <w:spacing w:after="80"/>
         <w:jc w:val="center"/>
-        <w:pBdr>
-          <w:bottom w:val="single" w:sz="8" w:space="2" w:color="1F7A46"/>
-        </w:pBdr>
       </w:pPr>
       <w:r>
-        <w:t xml:space="preserve">Gardena, CA  |  949-300-1641  |  </w:t>
+        <w:t xml:space="preserve">Gardena, CA | 949-300-1641 | sungjung0616@gmail.com | </w:t>
       </w:r>
       <w:hyperlink r:id="rId9">
         <w:r>
           <w:rPr>
-            <w:color w:val="1F7A46"/>
-            <w:u w:val="none"/>
-            <w:rFonts w:ascii="Arial" w:hAnsi="Arial"/>
-            <w:sz w:val="18"/>
-          </w:rPr>
-          <w:t>sungjung0616@gmail.com</w:t>
-        </w:r>
-      </w:hyperlink>
-      <w:r>
-        <w:t xml:space="preserve">  |  </w:t>
-      </w:r>
-      <w:hyperlink r:id="rId10">
-        <w:r>
-          <w:rPr>
-            <w:color w:val="1F7A46"/>
-            <w:u w:val="none"/>
-            <w:rFonts w:ascii="Arial" w:hAnsi="Arial"/>
-            <w:sz w:val="18"/>
+            <w:color w:val="197E4C"/>
+            <w:u w:val="single"/>
+            <w:sz w:val="20"/>
           </w:rPr>
           <w:t>LinkedIn</w:t>
         </w:r>
       </w:hyperlink>
       <w:r>
-        <w:t xml:space="preserve">  |  </w:t>
+        <w:t xml:space="preserve"> | </w:t>
       </w:r>
-      <w:hyperlink r:id="rId11">
+      <w:hyperlink r:id="rId10">
         <w:r>
           <w:rPr>
-            <w:color w:val="1F7A46"/>
-            <w:u w:val="none"/>
-            <w:rFonts w:ascii="Arial" w:hAnsi="Arial"/>
-            <w:sz w:val="18"/>
+            <w:color w:val="197E4C"/>
+            <w:u w:val="single"/>
+            <w:sz w:val="20"/>
           </w:rPr>
           <w:t>GitHub</w:t>
         </w:r>
       </w:hyperlink>
       <w:r>
-        <w:t xml:space="preserve">  |  </w:t>
+        <w:t xml:space="preserve"> | </w:t>
       </w:r>
-      <w:hyperlink r:id="rId12">
+      <w:hyperlink r:id="rId11">
         <w:r>
           <w:rPr>
-            <w:color w:val="1F7A46"/>
-            <w:u w:val="none"/>
-            <w:rFonts w:ascii="Arial" w:hAnsi="Arial"/>
-            <w:sz w:val="18"/>
+            <w:color w:val="197E4C"/>
+            <w:u w:val="single"/>
+            <w:sz w:val="20"/>
           </w:rPr>
           <w:t>Portfolio</w:t>
         </w:r>
@@ -98,387 +77,241 @@
     </w:p>
     <w:p>
       <w:pPr>
-        <w:pStyle w:val="Heading1"/>
+        <w:keepNext/>
         <w:spacing w:before="140" w:after="60"/>
-        <w:pBdr>
-          <w:bottom w:val="single" w:sz="8" w:space="2" w:color="B6C1BA"/>
-        </w:pBdr>
       </w:pPr>
       <w:r>
+        <w:rPr>
+          <w:b/>
+          <w:color w:val="162A3B"/>
+          <w:sz w:val="24"/>
+        </w:rPr>
         <w:t>PROFESSIONAL SUMMARY</w:t>
       </w:r>
     </w:p>
     <w:p>
-      <w:pPr>
-        <w:spacing w:after="60"/>
-      </w:pPr>
       <w:r>
-        <w:t>QA and operations professional with shipped-title game QA experience and a track record of improving real business workflows through practical automation. Contributed to Eternights development and PlayStation release QA, reduced a recurring regression cycle from approximately eight hours to four, and built Python-based order automation that reduced daily preparation from about three hours to thirty minutes. Combines manual testing, data validation, workflow design, and cross-functional problem solving with a B.S. in Computer Science.</w:t>
+        <w:t>Operations systems and quality professional who improves high-volume business workflows through structured validation, practical automation, and cross-functional delivery. Experience spans 3PL operations, marketplace data transformation, PlayStation release QA, and independently delivered cloud applications. Reduced a recurring shipping-data workflow from about three hours to 30 minutes and a regression cycle from about eight hours to four while preserving human review and coverage.</w:t>
       </w:r>
     </w:p>
     <w:p>
       <w:pPr>
-        <w:pStyle w:val="Heading1"/>
+        <w:keepNext/>
         <w:spacing w:before="140" w:after="60"/>
-        <w:pBdr>
-          <w:bottom w:val="single" w:sz="8" w:space="2" w:color="B6C1BA"/>
-        </w:pBdr>
       </w:pPr>
       <w:r>
+        <w:rPr>
+          <w:b/>
+          <w:color w:val="162A3B"/>
+          <w:sz w:val="24"/>
+        </w:rPr>
         <w:t>CORE SKILLS</w:t>
       </w:r>
     </w:p>
     <w:p>
       <w:pPr>
-        <w:spacing w:after="30"/>
+        <w:spacing w:after="20"/>
       </w:pPr>
       <w:r>
         <w:rPr>
           <w:b/>
-          <w:color w:val="12263A"/>
+          <w:color w:val="162A3B"/>
         </w:rPr>
-        <w:t xml:space="preserve">Quality Engineering: </w:t>
+        <w:t xml:space="preserve">Operations &amp; Delivery: </w:t>
       </w:r>
       <w:r>
-        <w:t>Manual Testing, Regression Testing, Functional Testing, Release Validation, Test Case Design, Defect Reporting, Localization QA, Result Review</w:t>
+        <w:t>3PL workflows, account coordination, process improvement, stakeholder communication, work instructions, exception management</w:t>
       </w:r>
     </w:p>
     <w:p>
       <w:pPr>
-        <w:spacing w:after="30"/>
+        <w:spacing w:after="20"/>
       </w:pPr>
       <w:r>
         <w:rPr>
           <w:b/>
-          <w:color w:val="12263A"/>
+          <w:color w:val="162A3B"/>
         </w:rPr>
-        <w:t xml:space="preserve">Automation &amp; Programming: </w:t>
+        <w:t xml:space="preserve">Quality &amp; Data: </w:t>
       </w:r>
       <w:r>
-        <w:t>Python, JavaScript, Google Apps Script, Unity Test Framework, Selenium (personal/technical projects)</w:t>
+        <w:t>Manual and regression testing, release validation, test cases, defect reporting, data validation, reconciliation, result review</w:t>
       </w:r>
     </w:p>
     <w:p>
       <w:pPr>
-        <w:spacing w:after="30"/>
+        <w:spacing w:after="20"/>
       </w:pPr>
       <w:r>
         <w:rPr>
           <w:b/>
-          <w:color w:val="12263A"/>
+          <w:color w:val="162A3B"/>
         </w:rPr>
-        <w:t xml:space="preserve">Development &amp; Data: </w:t>
+        <w:t xml:space="preserve">Automation &amp; Systems: </w:t>
       </w:r>
       <w:r>
-        <w:t>HTML, CSS, React, Node.js, Git, GitHub, SQL (basic), PostgreSQL, MongoDB</w:t>
+        <w:t>Python, JavaScript, Google Apps Script, Excel, Google Sheets, Extensiv WMS, Workpad OMS, Shopify, ECOUNT ERP (basic)</w:t>
       </w:r>
     </w:p>
     <w:p>
       <w:pPr>
-        <w:spacing w:after="30"/>
+        <w:spacing w:after="20"/>
       </w:pPr>
       <w:r>
         <w:rPr>
           <w:b/>
-          <w:color w:val="12263A"/>
+          <w:color w:val="162A3B"/>
         </w:rPr>
-        <w:t xml:space="preserve">Operational Systems: </w:t>
+        <w:t xml:space="preserve">Development: </w:t>
       </w:r>
       <w:r>
-        <w:t>Extensiv WMS, Workpad OMS, Shopify, Excel, Google Sheets, ECOUNT ERP (basic)</w:t>
+        <w:t>React, Node.js, HTML, CSS, Git/GitHub, SQL (basic), PostgreSQL, AWS configuration, Selenium projects, Unity Test Framework use</w:t>
       </w:r>
     </w:p>
     <w:p>
       <w:pPr>
-        <w:pStyle w:val="Heading1"/>
+        <w:keepNext/>
         <w:spacing w:before="140" w:after="60"/>
-        <w:pBdr>
-          <w:bottom w:val="single" w:sz="8" w:space="2" w:color="B6C1BA"/>
-        </w:pBdr>
       </w:pPr>
       <w:r>
+        <w:rPr>
+          <w:b/>
+          <w:color w:val="162A3B"/>
+          <w:sz w:val="24"/>
+        </w:rPr>
         <w:t>PROFESSIONAL EXPERIENCE</w:t>
       </w:r>
     </w:p>
     <w:p>
       <w:pPr>
         <w:keepNext/>
-        <w:tabs>
-          <w:tab w:pos="9288" w:val="left"/>
-        </w:tabs>
-        <w:spacing w:before="60" w:after="0"/>
+        <w:spacing w:before="90" w:after="30"/>
       </w:pPr>
       <w:r>
         <w:rPr>
           <w:b/>
-          <w:color w:val="12263A"/>
-          <w:sz w:val="20"/>
+          <w:color w:val="162A3B"/>
+          <w:sz w:val="21"/>
         </w:rPr>
         <w:t>Operations Manager - Account &amp; Warehouse Operations</w:t>
       </w:r>
       <w:r>
         <w:rPr>
-          <w:color w:val="535C65"/>
-          <w:sz w:val="18"/>
+          <w:b/>
+          <w:color w:val="4E5860"/>
         </w:rPr>
-        <w:t xml:space="preserve"> | GPS Logix | Compton, CA</w:t>
-      </w:r>
-      <w:r>
-        <w:rPr>
-          <w:b/>
-          <w:color w:val="535C65"/>
-          <w:sz w:val="18"/>
-        </w:rPr>
-        <w:tab/>
-        <w:t>2024 - Present</w:t>
+        <w:t xml:space="preserve"> | GPS Logix | Compton, CA | 2024 - Present</w:t>
       </w:r>
     </w:p>
     <w:p>
       <w:pPr>
-        <w:pStyle w:val="ResumeBullet"/>
+        <w:pStyle w:val="ListBullet"/>
+        <w:spacing w:after="28"/>
+        <w:ind w:left="230" w:hanging="187"/>
       </w:pPr>
       <w:r>
-        <w:rPr>
-          <w:color w:val="1F7A46"/>
-        </w:rPr>
-        <w:t xml:space="preserve">• </w:t>
-      </w:r>
-      <w:r>
-        <w:t>Helped establish a new 3PL operation, including account-specific warehouse locations, picking and packing flows, work instructions, and daily execution across Extensiv WMS and Workpad OMS.</w:t>
+        <w:t>Helped establish a new 3PL operation, including account-specific locations, picking and packing flows, work instructions, and daily execution across Extensiv WMS and Workpad OMS.</w:t>
       </w:r>
     </w:p>
     <w:p>
       <w:pPr>
-        <w:pStyle w:val="ResumeBullet"/>
+        <w:pStyle w:val="ListBullet"/>
+        <w:spacing w:after="28"/>
+        <w:ind w:left="230" w:hanging="187"/>
       </w:pPr>
       <w:r>
-        <w:rPr>
-          <w:color w:val="1F7A46"/>
-        </w:rPr>
-        <w:t xml:space="preserve">• </w:t>
-      </w:r>
-      <w:r>
-        <w:t>Designed an Excel-based SKU batching workflow to reduce unnecessary picking travel, then translated the operational requirement and partnered with the AcrossB development team until automated SKU separation was added to Workpad.</w:t>
+        <w:t>Designed an Excel-based SKU batching workflow to reduce picking travel, translated the operational requirement, and partnered with the AcrossB development team until automated SKU separation was added to Workpad.</w:t>
       </w:r>
     </w:p>
     <w:p>
       <w:pPr>
-        <w:pStyle w:val="ResumeBullet"/>
+        <w:pStyle w:val="ListBullet"/>
+        <w:spacing w:after="28"/>
+        <w:ind w:left="230" w:hanging="187"/>
       </w:pPr>
       <w:r>
-        <w:rPr>
-          <w:color w:val="1F7A46"/>
-        </w:rPr>
-        <w:t xml:space="preserve">• </w:t>
-      </w:r>
-      <w:r>
-        <w:t>Support a team operation that grew from approximately 3,000-3,500 daily orders at launch to about 11,000 typical daily orders across roughly 10 client accounts; coordinate a high-volume account and surface inventory and order risks.</w:t>
+        <w:t>Support an operation that grew from approximately 3,000-3,500 daily orders at launch to about 11,000 typical daily orders across roughly 10 client accounts; coordinate a high-volume account and surface inventory and order risks.</w:t>
       </w:r>
     </w:p>
     <w:p>
       <w:pPr>
-        <w:pStyle w:val="ResumeBullet"/>
+        <w:pStyle w:val="ListBullet"/>
+        <w:spacing w:after="28"/>
+        <w:ind w:left="230" w:hanging="187"/>
       </w:pPr>
       <w:r>
-        <w:rPr>
-          <w:color w:val="1F7A46"/>
-        </w:rPr>
-        <w:t xml:space="preserve">• </w:t>
-      </w:r>
-      <w:r>
-        <w:t>Implemented an AI-assisted Gmail, Google Sheets, and Apps Script workflow that classifies account communications, records inbound/outbound information, and distributes a daily operational summary.</w:t>
+        <w:t>Implemented an AI-assisted Gmail, Google Sheets, and Apps Script workflow that classifies account communications, records inbound and outbound information, and distributes a daily operational summary.</w:t>
       </w:r>
     </w:p>
     <w:p>
       <w:pPr>
-        <w:pStyle w:val="ResumeBullet"/>
+        <w:pStyle w:val="ListBullet"/>
+        <w:spacing w:after="28"/>
+        <w:ind w:left="230" w:hanging="187"/>
       </w:pPr>
       <w:r>
-        <w:rPr>
-          <w:color w:val="1F7A46"/>
-        </w:rPr>
-        <w:t xml:space="preserve">• </w:t>
-      </w:r>
-      <w:r>
-        <w:t>Built a scanner-based returns workflow in Google Apps Script that uses tracking and lot inputs to populate SKU and expiration data, reducing repetitive manual entry.</w:t>
+        <w:t>Built a scanner-based returns workflow that uses tracking and lot inputs to populate SKU and expiration data, reducing repetitive manual entry.</w:t>
       </w:r>
     </w:p>
     <w:p>
       <w:pPr>
         <w:keepNext/>
-        <w:tabs>
-          <w:tab w:pos="9288" w:val="left"/>
-        </w:tabs>
-        <w:spacing w:before="60" w:after="0"/>
+        <w:spacing w:before="90" w:after="30"/>
       </w:pPr>
       <w:r>
         <w:rPr>
           <w:b/>
-          <w:color w:val="12263A"/>
-          <w:sz w:val="20"/>
+          <w:color w:val="162A3B"/>
+          <w:sz w:val="21"/>
         </w:rPr>
         <w:t>QA Engineer</w:t>
       </w:r>
       <w:r>
         <w:rPr>
-          <w:color w:val="535C65"/>
-          <w:sz w:val="18"/>
+          <w:b/>
+          <w:color w:val="4E5860"/>
         </w:rPr>
-        <w:t xml:space="preserve"> | Studio Sai | Remote from South Korea</w:t>
-      </w:r>
-      <w:r>
-        <w:rPr>
-          <w:b/>
-          <w:color w:val="535C65"/>
-          <w:sz w:val="18"/>
-        </w:rPr>
-        <w:tab/>
-        <w:t>Dec 2021 - May 2024</w:t>
+        <w:t xml:space="preserve"> | Studio Sai | Remote from South Korea | Dec 2021 - May 2024</w:t>
       </w:r>
     </w:p>
     <w:p>
       <w:pPr>
-        <w:pStyle w:val="ResumeBullet"/>
+        <w:pStyle w:val="ListBullet"/>
+        <w:spacing w:after="28"/>
+        <w:ind w:left="230" w:hanging="187"/>
       </w:pPr>
       <w:r>
-        <w:rPr>
-          <w:color w:val="1F7A46"/>
-        </w:rPr>
-        <w:t xml:space="preserve">• </w:t>
-      </w:r>
-      <w:r>
-        <w:t>Supported development and PlayStation release quality for Eternights through gameplay, functional, regression, and release-focused testing in a fast-moving production environment.</w:t>
+        <w:t>Supported development and PlayStation release quality for Eternights through gameplay, functional, regression, localization, and release-focused testing.</w:t>
       </w:r>
     </w:p>
     <w:p>
       <w:pPr>
-        <w:pStyle w:val="ResumeBullet"/>
+        <w:pStyle w:val="ListBullet"/>
+        <w:spacing w:after="28"/>
+        <w:ind w:left="230" w:hanging="187"/>
       </w:pPr>
       <w:r>
-        <w:rPr>
-          <w:color w:val="1F7A46"/>
-        </w:rPr>
-        <w:t xml:space="preserve">• </w:t>
-      </w:r>
-      <w:r>
-        <w:t>Authored reproducible defect reports, reviewed results, validated fixes, and collaborated with developers to identify regressions and clarify expected behavior.</w:t>
+        <w:t>Authored reproducible defect reports, validated fixes, reviewed results, and collaborated with developers to identify regressions and clarify expected behavior.</w:t>
       </w:r>
     </w:p>
     <w:p>
       <w:pPr>
-        <w:pStyle w:val="ResumeBullet"/>
+        <w:pStyle w:val="ListBullet"/>
+        <w:spacing w:after="28"/>
+        <w:ind w:left="230" w:hanging="187"/>
       </w:pPr>
       <w:r>
-        <w:rPr>
-          <w:color w:val="1F7A46"/>
-        </w:rPr>
-        <w:t xml:space="preserve">• </w:t>
-      </w:r>
-      <w:r>
-        <w:t>Reduced a recurring end-to-end regression workflow from approximately eight hours to four by using developer-provided save states and checkpoints to remove redundant traversal while preserving validation coverage.</w:t>
+        <w:t>Reduced a recurring regression workflow from approximately eight hours to four by using developer-provided save states and checkpoints while preserving validation coverage.</w:t>
       </w:r>
     </w:p>
     <w:p>
       <w:pPr>
-        <w:pStyle w:val="ResumeBullet"/>
+        <w:pStyle w:val="ListBullet"/>
+        <w:spacing w:after="28"/>
+        <w:ind w:left="230" w:hanging="187"/>
       </w:pPr>
       <w:r>
-        <w:rPr>
-          <w:color w:val="1F7A46"/>
-        </w:rPr>
-        <w:t xml:space="preserve">• </w:t>
-      </w:r>
-      <w:r>
-        <w:t>Used Unity Test Framework features in the existing development environment for UI-focused automated validation alongside manual and regression testing.</w:t>
-      </w:r>
-    </w:p>
-    <w:p>
-      <w:pPr>
-        <w:keepNext/>
-        <w:tabs>
-          <w:tab w:pos="9288" w:val="left"/>
-        </w:tabs>
-        <w:spacing w:before="60" w:after="0"/>
-      </w:pPr>
-      <w:r>
-        <w:rPr>
-          <w:b/>
-          <w:color w:val="12263A"/>
-          <w:sz w:val="20"/>
-        </w:rPr>
-        <w:t>Database Manager</w:t>
-      </w:r>
-      <w:r>
-        <w:rPr>
-          <w:color w:val="535C65"/>
-          <w:sz w:val="18"/>
-        </w:rPr>
-        <w:t xml:space="preserve"> | GPS Logix | Carson, CA</w:t>
-      </w:r>
-      <w:r>
-        <w:rPr>
-          <w:b/>
-          <w:color w:val="535C65"/>
-          <w:sz w:val="18"/>
-        </w:rPr>
-        <w:tab/>
-        <w:t>Jun 2016 - Nov 2021</w:t>
-      </w:r>
-    </w:p>
-    <w:p>
-      <w:pPr>
-        <w:pStyle w:val="ResumeBullet"/>
-      </w:pPr>
-      <w:r>
-        <w:rPr>
-          <w:color w:val="1F7A46"/>
-        </w:rPr>
-        <w:t xml:space="preserve">• </w:t>
-      </w:r>
-      <w:r>
-        <w:t>Analyzed a recurring Coupang order workflow and built Python/openpyxl automation to map, normalize, validate, and prepare marketplace data for the GPS shipping-system upload format.</w:t>
-      </w:r>
-    </w:p>
-    <w:p>
-      <w:pPr>
-        <w:pStyle w:val="ResumeBullet"/>
-      </w:pPr>
-      <w:r>
-        <w:rPr>
-          <w:color w:val="1F7A46"/>
-        </w:rPr>
-        <w:t xml:space="preserve">• </w:t>
-      </w:r>
-      <w:r>
-        <w:t>Reduced approximate daily processing time from three hours to thirty minutes while retaining human review and final system upload control.</w:t>
-      </w:r>
-    </w:p>
-    <w:p>
-      <w:pPr>
-        <w:pStyle w:val="ResumeBullet"/>
-      </w:pPr>
-      <w:r>
-        <w:rPr>
-          <w:color w:val="1F7A46"/>
-        </w:rPr>
-        <w:t xml:space="preserve">• </w:t>
-      </w:r>
-      <w:r>
-        <w:t>Validated customs and contact fields, normalized postal and product data, handled options and bundle quantities, and separated incomplete or suspicious records for manual review.</w:t>
-      </w:r>
-    </w:p>
-    <w:p>
-      <w:pPr>
-        <w:pStyle w:val="ResumeBullet"/>
-      </w:pPr>
-      <w:r>
-        <w:rPr>
-          <w:color w:val="1F7A46"/>
-        </w:rPr>
-        <w:t xml:space="preserve">• </w:t>
-      </w:r>
-      <w:r>
-        <w:t>Identified recurring address and customs-document risks and helped strengthen pre-shipment validation requirements before orders entered the international shipping process.</w:t>
+        <w:t>Used Unity Test Framework features in the existing environment for UI-focused automated validation alongside manual and regression testing.</w:t>
       </w:r>
     </w:p>
     <w:p>
@@ -488,182 +321,239 @@
     </w:p>
     <w:p>
       <w:pPr>
-        <w:pStyle w:val="Heading1"/>
+        <w:keepNext/>
         <w:spacing w:before="140" w:after="60"/>
-        <w:pBdr>
-          <w:bottom w:val="single" w:sz="8" w:space="2" w:color="B6C1BA"/>
-        </w:pBdr>
       </w:pPr>
       <w:r>
-        <w:t>PROFESSIONAL EXPERIENCE - CONTINUED</w:t>
+        <w:rPr>
+          <w:b/>
+          <w:color w:val="162A3B"/>
+          <w:sz w:val="24"/>
+        </w:rPr>
+        <w:t>PROFESSIONAL EXPERIENCE CONTINUED</w:t>
       </w:r>
     </w:p>
     <w:p>
       <w:pPr>
         <w:keepNext/>
-        <w:tabs>
-          <w:tab w:pos="9288" w:val="left"/>
-        </w:tabs>
-        <w:spacing w:before="60" w:after="0"/>
+        <w:spacing w:before="90" w:after="30"/>
       </w:pPr>
       <w:r>
         <w:rPr>
           <w:b/>
-          <w:color w:val="12263A"/>
-          <w:sz w:val="20"/>
+          <w:color w:val="162A3B"/>
+          <w:sz w:val="21"/>
+        </w:rPr>
+        <w:t>Database Manager</w:t>
+      </w:r>
+      <w:r>
+        <w:rPr>
+          <w:b/>
+          <w:color w:val="4E5860"/>
+        </w:rPr>
+        <w:t xml:space="preserve"> | GPS Logix | Carson, CA | Jun 2016 - Nov 2021</w:t>
+      </w:r>
+    </w:p>
+    <w:p>
+      <w:pPr>
+        <w:pStyle w:val="ListBullet"/>
+        <w:spacing w:after="28"/>
+        <w:ind w:left="230" w:hanging="187"/>
+      </w:pPr>
+      <w:r>
+        <w:t>Analyzed a recurring Coupang order workflow and built Python/openpyxl automation to map, normalize, validate, and prepare marketplace data for the GPS shipping-system upload format.</w:t>
+      </w:r>
+    </w:p>
+    <w:p>
+      <w:pPr>
+        <w:pStyle w:val="ListBullet"/>
+        <w:spacing w:after="28"/>
+        <w:ind w:left="230" w:hanging="187"/>
+      </w:pPr>
+      <w:r>
+        <w:t>Reduced approximate daily preparation time from three hours to 30 minutes while retaining human review and final system-upload control.</w:t>
+      </w:r>
+    </w:p>
+    <w:p>
+      <w:pPr>
+        <w:pStyle w:val="ListBullet"/>
+        <w:spacing w:after="28"/>
+        <w:ind w:left="230" w:hanging="187"/>
+      </w:pPr>
+      <w:r>
+        <w:t>Validated customs and contact fields, normalized postal and product data, handled options and bundle quantities, and separated incomplete or suspicious records for manual review.</w:t>
+      </w:r>
+    </w:p>
+    <w:p>
+      <w:pPr>
+        <w:pStyle w:val="ListBullet"/>
+        <w:spacing w:after="28"/>
+        <w:ind w:left="230" w:hanging="187"/>
+      </w:pPr>
+      <w:r>
+        <w:t>Identified recurring address and customs-document risks and helped strengthen pre-shipment validation requirements before international shipping.</w:t>
+      </w:r>
+    </w:p>
+    <w:p>
+      <w:pPr>
+        <w:keepNext/>
+        <w:spacing w:before="90" w:after="30"/>
+      </w:pPr>
+      <w:r>
+        <w:rPr>
+          <w:b/>
+          <w:color w:val="162A3B"/>
+          <w:sz w:val="21"/>
         </w:rPr>
         <w:t>Owner - Operations &amp; Systems (Part-time)</w:t>
       </w:r>
       <w:r>
         <w:rPr>
-          <w:color w:val="535C65"/>
-          <w:sz w:val="18"/>
+          <w:b/>
+          <w:color w:val="4E5860"/>
         </w:rPr>
-        <w:t xml:space="preserve"> | LAYRD | Los Angeles, CA</w:t>
-      </w:r>
-      <w:r>
-        <w:rPr>
-          <w:b/>
-          <w:color w:val="535C65"/>
-          <w:sz w:val="18"/>
-        </w:rPr>
-        <w:tab/>
-        <w:t>Jul 2025 - Present</w:t>
+        <w:t xml:space="preserve"> | LAYRD | Los Angeles, CA | Jul 2025 - Present</w:t>
       </w:r>
     </w:p>
     <w:p>
       <w:pPr>
-        <w:pStyle w:val="ResumeBullet"/>
+        <w:pStyle w:val="ListBullet"/>
+        <w:spacing w:after="28"/>
+        <w:ind w:left="230" w:hanging="187"/>
       </w:pPr>
-      <w:r>
-        <w:rPr>
-          <w:color w:val="1F7A46"/>
-        </w:rPr>
-        <w:t xml:space="preserve">• </w:t>
-      </w:r>
       <w:r>
         <w:t>Own and co-operate a Shopify-based home and tableware business, with responsibility for storefront systems, fulfillment support, shipping labels, returns, financial records, and business administration.</w:t>
       </w:r>
     </w:p>
     <w:p>
       <w:pPr>
-        <w:pStyle w:val="ResumeBullet"/>
+        <w:pStyle w:val="ListBullet"/>
+        <w:spacing w:after="28"/>
+        <w:ind w:left="230" w:hanging="187"/>
       </w:pPr>
       <w:r>
-        <w:rPr>
-          <w:color w:val="1F7A46"/>
-        </w:rPr>
-        <w:t xml:space="preserve">• </w:t>
-      </w:r>
-      <w:r>
-        <w:t>Configure and troubleshoot the custom domain, storefront connections, shipping setup, and customer-facing functionality; share order fulfillment and take primary ownership of returns processing.</w:t>
+        <w:t>Configure and troubleshoot the custom domain, storefront connections, shipping setup, and customer-facing functionality; share fulfillment and take primary ownership of returns processing.</w:t>
       </w:r>
     </w:p>
     <w:p>
       <w:pPr>
-        <w:pStyle w:val="ResumeBullet"/>
+        <w:pStyle w:val="ListBullet"/>
+        <w:spacing w:after="28"/>
+        <w:ind w:left="230" w:hanging="187"/>
       </w:pPr>
       <w:r>
-        <w:rPr>
-          <w:color w:val="1F7A46"/>
-        </w:rPr>
-        <w:t xml:space="preserve">• </w:t>
-      </w:r>
-      <w:r>
-        <w:t>Maintain transaction and expense records, prepare documentation for CPA review, and independently completed the LAYRD trademark process through registration using AI-assisted research.</w:t>
+        <w:t>Maintain transaction and expense records for CPA review and independently completed the LAYRD trademark process through registration using AI-assisted research.</w:t>
       </w:r>
     </w:p>
     <w:p>
       <w:pPr>
-        <w:pStyle w:val="ResumeBullet"/>
+        <w:pStyle w:val="ListBullet"/>
+        <w:spacing w:after="28"/>
+        <w:ind w:left="230" w:hanging="187"/>
       </w:pPr>
-      <w:r>
-        <w:rPr>
-          <w:color w:val="1F7A46"/>
-        </w:rPr>
-        <w:t xml:space="preserve">• </w:t>
-      </w:r>
       <w:r>
         <w:t>Support local sales through consignment at CLAEDO in ROW DTLA and a display, consignment, and customer-pickup partnership with Baking Room.</w:t>
       </w:r>
     </w:p>
     <w:p>
       <w:pPr>
-        <w:pStyle w:val="Heading1"/>
+        <w:keepNext/>
         <w:spacing w:before="140" w:after="60"/>
-        <w:pBdr>
-          <w:bottom w:val="single" w:sz="8" w:space="2" w:color="B6C1BA"/>
-        </w:pBdr>
-      </w:pPr>
-      <w:r>
-        <w:t>SELECTED TECHNICAL WORK</w:t>
-      </w:r>
-    </w:p>
-    <w:p>
-      <w:pPr>
-        <w:spacing w:after="30"/>
       </w:pPr>
       <w:r>
         <w:rPr>
           <w:b/>
-          <w:color w:val="12263A"/>
+          <w:color w:val="162A3B"/>
+          <w:sz w:val="24"/>
+        </w:rPr>
+        <w:t>SELECTED PROJECTS</w:t>
+      </w:r>
+    </w:p>
+    <w:p>
+      <w:r>
+        <w:rPr>
+          <w:b/>
+          <w:color w:val="162A3B"/>
+        </w:rPr>
+        <w:t xml:space="preserve">Remembering Young Hoon - Independent Cloud Project: </w:t>
+      </w:r>
+      <w:r>
+        <w:t xml:space="preserve">Planned and delivered a bilingual memorial archive with reviewed submissions, role-based administration, private media storage, and asynchronous AWS image processing. Independently owned feature decisions, AWS setup, validation, and deployment using AI-assisted development. </w:t>
+      </w:r>
+      <w:hyperlink r:id="rId12">
+        <w:r>
+          <w:rPr>
+            <w:color w:val="197E4C"/>
+            <w:u w:val="single"/>
+            <w:sz w:val="20"/>
+          </w:rPr>
+          <w:t>Case Study</w:t>
+        </w:r>
+      </w:hyperlink>
+    </w:p>
+    <w:p>
+      <w:r>
+        <w:rPr>
+          <w:b/>
+          <w:color w:val="162A3B"/>
         </w:rPr>
         <w:t xml:space="preserve">Coupang Order Automation: </w:t>
       </w:r>
       <w:r>
-        <w:t>Python/openpyxl pipeline for mapping marketplace orders, validating critical fields, flagging exceptions, and generating upload-ready shipping data. github.com/SungJung0616/AutomationCoupangOrder</w:t>
+        <w:t xml:space="preserve">Python/openpyxl pipeline for mapping marketplace orders, validating critical fields, flagging exceptions, and generating upload-ready shipping data. </w:t>
       </w:r>
+      <w:hyperlink r:id="rId10">
+        <w:r>
+          <w:rPr>
+            <w:color w:val="197E4C"/>
+            <w:u w:val="single"/>
+            <w:sz w:val="20"/>
+          </w:rPr>
+          <w:t>GitHub</w:t>
+        </w:r>
+      </w:hyperlink>
+    </w:p>
+    <w:p>
+      <w:r>
+        <w:rPr>
+          <w:b/>
+          <w:color w:val="162A3B"/>
+        </w:rPr>
+        <w:t xml:space="preserve">Career Portfolio and Case Studies: </w:t>
+      </w:r>
+      <w:r>
+        <w:t xml:space="preserve">React and Three.js portfolio documenting verified QA, automation, operations, and end-to-end project ownership. </w:t>
+      </w:r>
+      <w:hyperlink r:id="rId11">
+        <w:r>
+          <w:rPr>
+            <w:color w:val="197E4C"/>
+            <w:u w:val="single"/>
+            <w:sz w:val="20"/>
+          </w:rPr>
+          <w:t>Portfolio</w:t>
+        </w:r>
+      </w:hyperlink>
     </w:p>
     <w:p>
       <w:pPr>
-        <w:spacing w:after="30"/>
+        <w:keepNext/>
+        <w:spacing w:before="140" w:after="60"/>
       </w:pPr>
       <w:r>
         <w:rPr>
           <w:b/>
-          <w:color w:val="12263A"/>
+          <w:color w:val="162A3B"/>
+          <w:sz w:val="24"/>
         </w:rPr>
-        <w:t xml:space="preserve">Portfolio &amp; Case Studies: </w:t>
-      </w:r>
-      <w:r>
-        <w:t>React portfolio documenting verified QA, automation, 3PL operations, and business-systems contributions with explicit ownership boundaries. sj-personalportfolio.netlify.app</w:t>
-      </w:r>
-    </w:p>
-    <w:p>
-      <w:pPr>
-        <w:spacing w:after="30"/>
-      </w:pPr>
-      <w:r>
-        <w:rPr>
-          <w:b/>
-          <w:color w:val="12263A"/>
-        </w:rPr>
-        <w:t xml:space="preserve">Full-stack Project Archive: </w:t>
-      </w:r>
-      <w:r>
-        <w:t>React and Node.js learning projects covering authentication, CRUD workflows, API integration, responsive interfaces, and backend-connected applications. github.com/SungJung0616</w:t>
-      </w:r>
-    </w:p>
-    <w:p>
-      <w:pPr>
-        <w:pStyle w:val="Heading1"/>
-        <w:spacing w:before="140" w:after="60"/>
-        <w:pBdr>
-          <w:bottom w:val="single" w:sz="8" w:space="2" w:color="B6C1BA"/>
-        </w:pBdr>
-      </w:pPr>
-      <w:r>
         <w:t>EDUCATION &amp; CERTIFICATIONS</w:t>
       </w:r>
     </w:p>
     <w:p>
-      <w:pPr>
-        <w:spacing w:after="30"/>
-      </w:pPr>
       <w:r>
         <w:rPr>
           <w:b/>
-          <w:color w:val="12263A"/>
+          <w:color w:val="162A3B"/>
         </w:rPr>
         <w:t xml:space="preserve">Education: </w:t>
       </w:r>
@@ -672,13 +562,10 @@
       </w:r>
     </w:p>
     <w:p>
-      <w:pPr>
-        <w:spacing w:after="30"/>
-      </w:pPr>
       <w:r>
         <w:rPr>
           <w:b/>
-          <w:color w:val="12263A"/>
+          <w:color w:val="162A3B"/>
         </w:rPr>
         <w:t xml:space="preserve">Certifications: </w:t>
       </w:r>
@@ -686,52 +573,10 @@
         <w:t>ISTQB Certified Tester - Foundation Level; ISTQB Agile Tester; Microsoft Office Specialist</w:t>
       </w:r>
     </w:p>
-    <w:p>
-      <w:pPr>
-        <w:pStyle w:val="Heading1"/>
-        <w:spacing w:before="140" w:after="60"/>
-        <w:pBdr>
-          <w:bottom w:val="single" w:sz="8" w:space="2" w:color="B6C1BA"/>
-        </w:pBdr>
-      </w:pPr>
-      <w:r>
-        <w:t>ADDITIONAL INFORMATION</w:t>
-      </w:r>
-    </w:p>
-    <w:p>
-      <w:pPr>
-        <w:spacing w:after="30"/>
-      </w:pPr>
-      <w:r>
-        <w:rPr>
-          <w:b/>
-          <w:color w:val="12263A"/>
-        </w:rPr>
-        <w:t xml:space="preserve">Target Roles: </w:t>
-      </w:r>
-      <w:r>
-        <w:t>QA Automation Engineer, Software QA Engineer, SDET, Game QA Engineer, Automation Engineer</w:t>
-      </w:r>
-    </w:p>
-    <w:p>
-      <w:pPr>
-        <w:spacing w:after="30"/>
-      </w:pPr>
-      <w:r>
-        <w:rPr>
-          <w:b/>
-          <w:color w:val="12263A"/>
-        </w:rPr>
-        <w:t xml:space="preserve">Work Style: </w:t>
-      </w:r>
-      <w:r>
-        <w:t>Ownership mindset, structured troubleshooting, data-driven validation, cross-functional collaboration, continuous improvement</w:t>
-      </w:r>
-    </w:p>
     <w:sectPr>
       <w:footerReference w:type="default" r:id="rId13"/>
       <w:pgSz w:w="12240" w:h="15840"/>
-      <w:pgMar w:top="749" w:right="893" w:bottom="691" w:left="893" w:header="360" w:footer="360" w:gutter="0"/>
+      <w:pgMar w:top="691" w:right="835" w:bottom="648" w:left="835" w:header="720" w:footer="720" w:gutter="0"/>
       <w:cols w:space="720"/>
       <w:docGrid w:linePitch="360"/>
     </w:sectPr>
@@ -749,10 +594,10 @@
     <w:r>
       <w:rPr>
         <w:rFonts w:ascii="Arial" w:hAnsi="Arial"/>
-        <w:color w:val="535C65"/>
+        <w:color w:val="4E5860"/>
         <w:sz w:val="16"/>
       </w:rPr>
-      <w:t>Sung Jung | QA, Automation &amp; Operations Systems</w:t>
+      <w:t>Sung Jung | Operations Systems, Quality Engineering &amp; Workflow Automation</w:t>
     </w:r>
   </w:p>
 </w:ftr>
@@ -1122,12 +967,11 @@
     <w:qFormat/>
     <w:rsid w:val="00FC693F"/>
     <w:pPr>
-      <w:spacing w:after="60" w:line="264" w:lineRule="auto"/>
+      <w:spacing w:after="44" w:line="245" w:lineRule="auto"/>
     </w:pPr>
     <w:rPr>
       <w:rFonts w:ascii="Arial" w:hAnsi="Arial"/>
-      <w:color w:val="141618"/>
-      <w:sz w:val="18"/>
+      <w:sz w:val="20"/>
     </w:rPr>
   </w:style>
   <w:style w:type="paragraph" w:styleId="Header">
@@ -1185,15 +1029,15 @@
     <w:pPr>
       <w:keepNext/>
       <w:keepLines/>
-      <w:spacing w:before="160" w:after="60"/>
+      <w:spacing w:before="480" w:after="0"/>
       <w:outlineLvl w:val="0"/>
     </w:pPr>
     <w:rPr>
-      <w:rFonts w:asciiTheme="majorHAnsi" w:eastAsiaTheme="majorEastAsia" w:hAnsiTheme="majorHAnsi" w:cstheme="majorBidi" w:ascii="Arial" w:hAnsi="Arial"/>
+      <w:rFonts w:asciiTheme="majorHAnsi" w:eastAsiaTheme="majorEastAsia" w:hAnsiTheme="majorHAnsi" w:cstheme="majorBidi"/>
       <w:b/>
       <w:bCs/>
-      <w:color w:val="12263A"/>
-      <w:sz w:val="22"/>
+      <w:color w:val="365F91" w:themeColor="accent1" w:themeShade="BF"/>
+      <w:sz w:val="28"/>
       <w:szCs w:val="28"/>
     </w:rPr>
   </w:style>
@@ -1209,15 +1053,15 @@
     <w:pPr>
       <w:keepNext/>
       <w:keepLines/>
-      <w:spacing w:before="100" w:after="20"/>
+      <w:spacing w:before="200" w:after="0"/>
       <w:outlineLvl w:val="1"/>
     </w:pPr>
     <w:rPr>
-      <w:rFonts w:asciiTheme="majorHAnsi" w:eastAsiaTheme="majorEastAsia" w:hAnsiTheme="majorHAnsi" w:cstheme="majorBidi" w:ascii="Arial" w:hAnsi="Arial"/>
+      <w:rFonts w:asciiTheme="majorHAnsi" w:eastAsiaTheme="majorEastAsia" w:hAnsiTheme="majorHAnsi" w:cstheme="majorBidi"/>
       <w:b/>
       <w:bCs/>
-      <w:color w:val="12263A"/>
-      <w:sz w:val="20"/>
+      <w:color w:val="4F81BD" w:themeColor="accent1"/>
+      <w:sz w:val="26"/>
       <w:szCs w:val="26"/>
     </w:rPr>
   </w:style>
@@ -1233,15 +1077,14 @@
     <w:pPr>
       <w:keepNext/>
       <w:keepLines/>
-      <w:spacing w:before="60" w:after="20"/>
+      <w:spacing w:before="200" w:after="0"/>
       <w:outlineLvl w:val="2"/>
     </w:pPr>
     <w:rPr>
-      <w:rFonts w:asciiTheme="majorHAnsi" w:eastAsiaTheme="majorEastAsia" w:hAnsiTheme="majorHAnsi" w:cstheme="majorBidi" w:ascii="Arial" w:hAnsi="Arial"/>
+      <w:rFonts w:asciiTheme="majorHAnsi" w:eastAsiaTheme="majorEastAsia" w:hAnsiTheme="majorHAnsi" w:cstheme="majorBidi"/>
       <w:b/>
       <w:bCs/>
-      <w:color w:val="141618"/>
-      <w:sz w:val="19"/>
+      <w:color w:val="4F81BD" w:themeColor="accent1"/>
     </w:rPr>
   </w:style>
   <w:style w:type="paragraph" w:styleId="Heading4">
@@ -12812,14 +12655,6 @@
         <w:shd w:val="clear" w:color="auto" w:fill="FBCAA2" w:themeFill="accent6" w:themeFillTint="7F"/>
       </w:tcPr>
     </w:tblStylePr>
-  </w:style>
-  <w:style w:type="paragraph" w:customStyle="1" w:styleId="ResumeBullet">
-    <w:name w:val="Resume Bullet"/>
-    <w:basedOn w:val="Normal"/>
-    <w:pPr>
-      <w:spacing w:after="44" w:line="259" w:lineRule="auto"/>
-      <w:ind w:left="259" w:hanging="187"/>
-    </w:pPr>
   </w:style>
 </w:styles>
 </file>

</xml_diff>